<commit_message>
Rewrite introduction around adaptive multiscale forecasting
</commit_message>
<xml_diff>
--- a/word_output/2026.09.19v2.docx
+++ b/word_output/2026.09.19v2.docx
@@ -440,204 +440,14 @@
           <ns0:color ns0:val="000000"/>
         </ns0:rPr>
       </ns0:pPr>
-      <ns0:r ns0:rsidRPr="00B14FA3">
+      <ns0:r>
         <ns0:rPr>
           <ns0:rFonts ns0:eastAsia="宋体"/>
           <ns0:color ns0:val="000000"/>
           <ns0:sz ns0:val="21"/>
           <ns0:szCs ns0:val="21"/>
         </ns0:rPr>
-        <ns0:t>随着网络业务规模和业务类型持续增长，骨干网络流量呈现出明显的时变性、突发性和多时间尺度变化特征。源</ns0:t>
-      </ns0:r>
-      <ns0:r ns0:rsidRPr="00B14FA3">
-        <ns0:rPr>
-          <ns0:rFonts ns0:eastAsia="宋体"/>
-          <ns0:color ns0:val="000000"/>
-          <ns0:sz ns0:val="21"/>
-          <ns0:szCs ns0:val="21"/>
-        </ns0:rPr>
-        <ns0:t>—</ns0:t>
-      </ns0:r>
-      <ns0:r ns0:rsidRPr="00B14FA3">
-        <ns0:rPr>
-          <ns0:rFonts ns0:eastAsia="宋体"/>
-          <ns0:color ns0:val="000000"/>
-          <ns0:sz ns0:val="21"/>
-          <ns0:szCs ns0:val="21"/>
-        </ns0:rPr>
-        <ns0:t>目的节点对（</ns0:t>
-      </ns0:r>
-      <ns0:r ns0:rsidRPr="00B14FA3">
-        <ns0:rPr>
-          <ns0:rFonts ns0:eastAsia="宋体"/>
-          <ns0:color ns0:val="000000"/>
-          <ns0:sz ns0:val="21"/>
-          <ns0:szCs ns0:val="21"/>
-        </ns0:rPr>
-        <ns0:t>origin-destination</ns0:t>
-      </ns0:r>
-      <ns0:r ns0:rsidRPr="00B14FA3">
-        <ns0:rPr>
-          <ns0:rFonts ns0:eastAsia="宋体"/>
-          <ns0:color ns0:val="000000"/>
-          <ns0:sz ns0:val="21"/>
-          <ns0:szCs ns0:val="21"/>
-        </ns0:rPr>
-        <ns0:t>，</ns0:t>
-      </ns0:r>
-      <ns0:r ns0:rsidRPr="00B14FA3">
-        <ns0:rPr>
-          <ns0:rFonts ns0:eastAsia="宋体"/>
-          <ns0:color ns0:val="000000"/>
-          <ns0:sz ns0:val="21"/>
-          <ns0:szCs ns0:val="21"/>
-        </ns0:rPr>
-        <ns0:t>OD</ns0:t>
-      </ns0:r>
-      <ns0:r ns0:rsidRPr="00B14FA3">
-        <ns0:rPr>
-          <ns0:rFonts ns0:eastAsia="宋体"/>
-          <ns0:color ns0:val="000000"/>
-          <ns0:sz ns0:val="21"/>
-          <ns0:szCs ns0:val="21"/>
-        </ns0:rPr>
-        <ns0:t>）流量能够反映网络入口与出口之间的业务需求，其短期预测结果可为容量规划、拥塞预警、流量工程和资源调度提供依据。现有网络流量预测方法已由传统统计模型逐步发展到机器学习和深度学习方法</ns0:t>
-      </ns0:r>
-      <ns0:r ns0:rsidRPr="00B14FA3">
-        <ns0:rPr>
-          <ns0:rFonts ns0:eastAsia="宋体"/>
-          <ns0:color ns0:val="000000"/>
-          <ns0:sz ns0:val="21"/>
-          <ns0:szCs ns0:val="21"/>
-        </ns0:rPr>
-        <ns0:t>[1]</ns0:t>
-      </ns0:r>
-      <ns0:r ns0:rsidRPr="00B14FA3">
-        <ns0:rPr>
-          <ns0:rFonts ns0:eastAsia="宋体"/>
-          <ns0:color ns0:val="000000"/>
-          <ns0:sz ns0:val="21"/>
-          <ns0:szCs ns0:val="21"/>
-        </ns0:rPr>
-        <ns0:t>。针对网络流量中的时空相关性，</ns0:t>
-      </ns0:r>
-      <ns0:r ns0:rsidRPr="00B14FA3">
-        <ns0:rPr>
-          <ns0:rFonts ns0:eastAsia="宋体"/>
-          <ns0:color ns0:val="000000"/>
-          <ns0:sz ns0:val="21"/>
-          <ns0:szCs ns0:val="21"/>
-        </ns0:rPr>
-        <ns0:t>Qin</ns0:t>
-      </ns0:r>
-      <ns0:r ns0:rsidRPr="00B14FA3">
-        <ns0:rPr>
-          <ns0:rFonts ns0:eastAsia="宋体"/>
-          <ns0:color ns0:val="000000"/>
-          <ns0:sz ns0:val="21"/>
-          <ns0:szCs ns0:val="21"/>
-        </ns0:rPr>
-        <ns0:t>等</ns0:t>
-      </ns0:r>
-      <ns0:r ns0:rsidRPr="00B14FA3">
-        <ns0:rPr>
-          <ns0:rFonts ns0:eastAsia="宋体"/>
-          <ns0:color ns0:val="000000"/>
-          <ns0:sz ns0:val="21"/>
-          <ns0:szCs ns0:val="21"/>
-        </ns0:rPr>
-        <ns0:t>[2]</ns0:t>
-      </ns0:r>
-      <ns0:r ns0:rsidRPr="00B14FA3">
-        <ns0:rPr>
-          <ns0:rFonts ns0:eastAsia="宋体"/>
-          <ns0:color ns0:val="000000"/>
-          <ns0:sz ns0:val="21"/>
-          <ns0:szCs ns0:val="21"/>
-        </ns0:rPr>
-        <ns0:t>采用图神经网络建模通信网络中的空间依赖关系；韦烜等</ns0:t>
-      </ns0:r>
-      <ns0:r ns0:rsidRPr="00B14FA3">
-        <ns0:rPr>
-          <ns0:rFonts ns0:eastAsia="宋体"/>
-          <ns0:color ns0:val="000000"/>
-          <ns0:sz ns0:val="21"/>
-          <ns0:szCs ns0:val="21"/>
-        </ns0:rPr>
-        <ns0:t>[9]</ns0:t>
-      </ns0:r>
-      <ns0:r ns0:rsidRPr="00B14FA3">
-        <ns0:rPr>
-          <ns0:rFonts ns0:eastAsia="宋体"/>
-          <ns0:color ns0:val="000000"/>
-          <ns0:sz ns0:val="21"/>
-          <ns0:szCs ns0:val="21"/>
-        </ns0:rPr>
-        <ns0:t>对大型</ns0:t>
-      </ns0:r>
-      <ns0:r ns0:rsidRPr="00B14FA3">
-        <ns0:rPr>
-          <ns0:rFonts ns0:eastAsia="宋体"/>
-          <ns0:color ns0:val="000000"/>
-          <ns0:sz ns0:val="21"/>
-          <ns0:szCs ns0:val="21"/>
-        </ns0:rPr>
-        <ns0:t>互联网协议（Internet Protocol，IP）</ns0:t>
-      </ns0:r>
-      <ns0:r ns0:rsidRPr="00B14FA3">
-        <ns0:rPr>
-          <ns0:rFonts ns0:eastAsia="宋体"/>
-          <ns0:color ns0:val="000000"/>
-          <ns0:sz ns0:val="21"/>
-          <ns0:szCs ns0:val="21"/>
-        </ns0:rPr>
-        <ns0:t>网络流量矩阵的分析与预测进行了研究，表明</ns0:t>
-      </ns0:r>
-      <ns0:r ns0:rsidRPr="00B14FA3">
-        <ns0:rPr>
-          <ns0:rFonts ns0:eastAsia="宋体"/>
-          <ns0:color ns0:val="000000"/>
-          <ns0:sz ns0:val="21"/>
-          <ns0:szCs ns0:val="21"/>
-        </ns0:rPr>
-        <ns0:t>OD</ns0:t>
-      </ns0:r>
-      <ns0:r ns0:rsidRPr="00B14FA3">
-        <ns0:rPr>
-          <ns0:rFonts ns0:eastAsia="宋体"/>
-          <ns0:color ns0:val="000000"/>
-          <ns0:sz ns0:val="21"/>
-          <ns0:szCs ns0:val="21"/>
-        </ns0:rPr>
-        <ns0:t>流量预测在实际网络运行管理中具有应用价值。然而，图结构建模通常依赖网络拓扑或较复杂的特征交互，</ns0:t>
-      </ns0:r>
-      <ns0:r ns0:rsidRPr="00B14FA3">
-        <ns0:rPr>
-          <ns0:rFonts ns0:eastAsia="宋体"/>
-          <ns0:color ns0:val="000000"/>
-          <ns0:sz ns0:val="21"/>
-          <ns0:szCs ns0:val="21"/>
-        </ns0:rPr>
-        <ns0:lastRenderedPageBreak/>
-        <ns0:t>对于只利用历史</ns0:t>
-      </ns0:r>
-      <ns0:r ns0:rsidRPr="00B14FA3">
-        <ns0:rPr>
-          <ns0:rFonts ns0:eastAsia="宋体"/>
-          <ns0:color ns0:val="000000"/>
-          <ns0:sz ns0:val="21"/>
-          <ns0:szCs ns0:val="21"/>
-        </ns0:rPr>
-        <ns0:t>OD</ns0:t>
-      </ns0:r>
-      <ns0:r ns0:rsidRPr="00B14FA3">
-        <ns0:rPr>
-          <ns0:rFonts ns0:eastAsia="宋体"/>
-          <ns0:color ns0:val="000000"/>
-          <ns0:sz ns0:val="21"/>
-          <ns0:szCs ns0:val="21"/>
-        </ns0:rPr>
-        <ns0:t>流量序列进行轻量预测的场景，仍存在进一步简化模型结构的空间。</ns0:t>
+        <ns0:t>随着云计算、视频业务和数据中心互联等网络应用持续发展，骨干网络业务需求呈现明显的时变性、突发性和多时间尺度特征。源—目的节点对（origin-destination，OD）流量能够刻画网络入口与出口之间的业务需求，其短期预测结果可为容量规划、拥塞预警、流量工程和资源调度提供依据。网络流量预测方法已由传统统计模型逐步发展到机器学习和深度学习方法[1]。针对通信网络中的时空相关性，Qin等[2]采用图神经网络建模空间依赖关系；韦烜等[9]对大型互联网协议（Internet Protocol，IP）网络流量矩阵的分析预测进行了研究。这类方法拓展了流量预测的建模能力，但对于仅利用历史OD流量、强调结构简洁和参数规模受控的应用场景，仍有必要探索更轻量的时序建模方式。</ns0:t>
       </ns0:r>
     </ns0:p>
     <ns0:p ns2:paraId="63AA998F" ns2:textId="77777777" ns0:rsidR="00B14FA3" ns0:rsidRPr="00B14FA3" ns0:rsidRDefault="00B14FA3" ns0:rsidP="00B14FA3">
@@ -646,266 +456,14 @@
           <ns0:color ns0:val="000000"/>
         </ns0:rPr>
       </ns0:pPr>
-      <ns0:r ns0:rsidRPr="00B14FA3">
+      <ns0:r>
         <ns0:rPr>
           <ns0:rFonts ns0:eastAsia="宋体"/>
           <ns0:color ns0:val="000000"/>
           <ns0:sz ns0:val="21"/>
           <ns0:szCs ns0:val="21"/>
         </ns0:rPr>
-        <ns0:t>网络流量在不同时间尺度上具有不同的变化特征。较细时间尺度能够保留局部波动和突发信息，较粗时间尺度则有利于平滑短期扰动并突出整体趋势。</ns0:t>
-      </ns0:r>
-      <ns0:r ns0:rsidRPr="00B14FA3">
-        <ns0:rPr>
-          <ns0:rFonts ns0:eastAsia="宋体"/>
-          <ns0:color ns0:val="000000"/>
-          <ns0:sz ns0:val="21"/>
-          <ns0:szCs ns0:val="21"/>
-        </ns0:rPr>
-        <ns0:t>Zhou</ns0:t>
-      </ns0:r>
-      <ns0:r ns0:rsidRPr="00B14FA3">
-        <ns0:rPr>
-          <ns0:rFonts ns0:eastAsia="宋体"/>
-          <ns0:color ns0:val="000000"/>
-          <ns0:sz ns0:val="21"/>
-          <ns0:szCs ns0:val="21"/>
-        </ns0:rPr>
-        <ns0:t>等</ns0:t>
-      </ns0:r>
-      <ns0:r ns0:rsidRPr="00B14FA3">
-        <ns0:rPr>
-          <ns0:rFonts ns0:eastAsia="宋体"/>
-          <ns0:color ns0:val="000000"/>
-          <ns0:sz ns0:val="21"/>
-          <ns0:szCs ns0:val="21"/>
-        </ns0:rPr>
-        <ns0:t>[3]</ns0:t>
-      </ns0:r>
-      <ns0:r ns0:rsidRPr="00B14FA3">
-        <ns0:rPr>
-          <ns0:rFonts ns0:eastAsia="宋体"/>
-          <ns0:color ns0:val="000000"/>
-          <ns0:sz ns0:val="21"/>
-          <ns0:szCs ns0:val="21"/>
-        </ns0:rPr>
-        <ns0:t>利用多尺度回声状态网络提取不同时间尺度的流量特征；</ns0:t>
-      </ns0:r>
-      <ns0:r ns0:rsidRPr="00B14FA3">
-        <ns0:rPr>
-          <ns0:rFonts ns0:eastAsia="宋体"/>
-          <ns0:color ns0:val="000000"/>
-          <ns0:sz ns0:val="21"/>
-          <ns0:szCs ns0:val="21"/>
-        </ns0:rPr>
-        <ns0:t>TimeMixer</ns0:t>
-      </ns0:r>
-      <ns0:r ns0:rsidRPr="00B14FA3">
-        <ns0:rPr>
-          <ns0:rFonts ns0:eastAsia="宋体"/>
-          <ns0:color ns0:val="000000"/>
-          <ns0:sz ns0:val="21"/>
-          <ns0:szCs ns0:val="21"/>
-        </ns0:rPr>
-        <ns0:t>通过多尺度分解与混合机制实现不同分辨率信息的交互</ns0:t>
-      </ns0:r>
-      <ns0:r ns0:rsidRPr="00B14FA3">
-        <ns0:rPr>
-          <ns0:rFonts ns0:eastAsia="宋体"/>
-          <ns0:color ns0:val="000000"/>
-          <ns0:sz ns0:val="21"/>
-          <ns0:szCs ns0:val="21"/>
-        </ns0:rPr>
-        <ns0:t>[7]</ns0:t>
-      </ns0:r>
-      <ns0:r ns0:rsidRPr="00B14FA3">
-        <ns0:rPr>
-          <ns0:rFonts ns0:eastAsia="宋体"/>
-          <ns0:color ns0:val="000000"/>
-          <ns0:sz ns0:val="21"/>
-          <ns0:szCs ns0:val="21"/>
-        </ns0:rPr>
-        <ns0:t>；</ns0:t>
-      </ns0:r>
-      <ns0:r ns0:rsidRPr="00B14FA3">
-        <ns0:rPr>
-          <ns0:rFonts ns0:eastAsia="宋体"/>
-          <ns0:color ns0:val="000000"/>
-          <ns0:sz ns0:val="21"/>
-          <ns0:szCs ns0:val="21"/>
-        </ns0:rPr>
-        <ns0:t>CycleLLH</ns0:t>
-      </ns0:r>
-      <ns0:r ns0:rsidRPr="00B14FA3">
-        <ns0:rPr>
-          <ns0:rFonts ns0:eastAsia="宋体"/>
-          <ns0:color ns0:val="000000"/>
-          <ns0:sz ns0:val="21"/>
-          <ns0:szCs ns0:val="21"/>
-        </ns0:rPr>
-        <ns0:t>则从周期性整合角度提高网络流量预测能力</ns0:t>
-      </ns0:r>
-      <ns0:r ns0:rsidRPr="00B14FA3">
-        <ns0:rPr>
-          <ns0:rFonts ns0:eastAsia="宋体"/>
-          <ns0:color ns0:val="000000"/>
-          <ns0:sz ns0:val="21"/>
-          <ns0:szCs ns0:val="21"/>
-        </ns0:rPr>
-        <ns0:t>[10]</ns0:t>
-      </ns0:r>
-      <ns0:r ns0:rsidRPr="00B14FA3">
-        <ns0:rPr>
-          <ns0:rFonts ns0:eastAsia="宋体"/>
-          <ns0:color ns0:val="000000"/>
-          <ns0:sz ns0:val="21"/>
-          <ns0:szCs ns0:val="21"/>
-        </ns0:rPr>
-        <ns0:t>。除时域多尺度建模外，频域方法也被广泛用于时间序列预测。</ns0:t>
-      </ns0:r>
-      <ns0:r ns0:rsidRPr="00B14FA3">
-        <ns0:rPr>
-          <ns0:rFonts ns0:eastAsia="宋体"/>
-          <ns0:color ns0:val="000000"/>
-          <ns0:sz ns0:val="21"/>
-          <ns0:szCs ns0:val="21"/>
-        </ns0:rPr>
-        <ns0:t>频率增强分解Transformer（Frequency Enhanced Decomposed Transformer，FEDformer）</ns0:t>
-      </ns0:r>
-      <ns0:r ns0:rsidRPr="00B14FA3">
-        <ns0:rPr>
-          <ns0:rFonts ns0:eastAsia="宋体"/>
-          <ns0:color ns0:val="000000"/>
-          <ns0:sz ns0:val="21"/>
-          <ns0:szCs ns0:val="21"/>
-        </ns0:rPr>
-        <ns0:t>利用频域增强机制提取主要周期成分</ns0:t>
-      </ns0:r>
-      <ns0:r ns0:rsidRPr="00B14FA3">
-        <ns0:rPr>
-          <ns0:rFonts ns0:eastAsia="宋体"/>
-          <ns0:color ns0:val="000000"/>
-          <ns0:sz ns0:val="21"/>
-          <ns0:szCs ns0:val="21"/>
-        </ns0:rPr>
-        <ns0:t>[5]</ns0:t>
-      </ns0:r>
-      <ns0:r ns0:rsidRPr="00B14FA3">
-        <ns0:rPr>
-          <ns0:rFonts ns0:eastAsia="宋体"/>
-          <ns0:color ns0:val="000000"/>
-          <ns0:sz ns0:val="21"/>
-          <ns0:szCs ns0:val="21"/>
-        </ns0:rPr>
-        <ns0:t>，</ns0:t>
-      </ns0:r>
-      <ns0:r ns0:rsidRPr="00B14FA3">
-        <ns0:rPr>
-          <ns0:rFonts ns0:eastAsia="宋体"/>
-          <ns0:color ns0:val="000000"/>
-          <ns0:sz ns0:val="21"/>
-          <ns0:szCs ns0:val="21"/>
-        </ns0:rPr>
-        <ns0:t>频率插值时间序列分析（Frequency Interpolation Time Series Analysis，FITS）</ns0:t>
-      </ns0:r>
-      <ns0:r ns0:rsidRPr="00B14FA3">
-        <ns0:rPr>
-          <ns0:rFonts ns0:eastAsia="宋体"/>
-          <ns0:color ns0:val="000000"/>
-          <ns0:sz ns0:val="21"/>
-          <ns0:szCs ns0:val="21"/>
-        </ns0:rPr>
-        <ns0:t>通过频率插值实现轻量时间序列预测</ns0:t>
-      </ns0:r>
-      <ns0:r ns0:rsidRPr="00B14FA3">
-        <ns0:rPr>
-          <ns0:rFonts ns0:eastAsia="宋体"/>
-          <ns0:color ns0:val="000000"/>
-          <ns0:sz ns0:val="21"/>
-          <ns0:szCs ns0:val="21"/>
-        </ns0:rPr>
-        <ns0:t>[6]</ns0:t>
-      </ns0:r>
-      <ns0:r ns0:rsidRPr="00B14FA3">
-        <ns0:rPr>
-          <ns0:rFonts ns0:eastAsia="宋体"/>
-          <ns0:color ns0:val="000000"/>
-          <ns0:sz ns0:val="21"/>
-          <ns0:szCs ns0:val="21"/>
-        </ns0:rPr>
-        <ns0:t>；</ns0:t>
-      </ns0:r>
-      <ns0:r ns0:rsidRPr="00B14FA3">
-        <ns0:rPr>
-          <ns0:rFonts ns0:eastAsia="宋体"/>
-          <ns0:color ns0:val="000000"/>
-          <ns0:sz ns0:val="21"/>
-          <ns0:szCs ns0:val="21"/>
-        </ns0:rPr>
-        <ns0:t>Tang</ns0:t>
-      </ns0:r>
-      <ns0:r ns0:rsidRPr="00B14FA3">
-        <ns0:rPr>
-          <ns0:rFonts ns0:eastAsia="宋体"/>
-          <ns0:color ns0:val="000000"/>
-          <ns0:sz ns0:val="21"/>
-          <ns0:szCs ns0:val="21"/>
-        </ns0:rPr>
-        <ns0:t>等</ns0:t>
-      </ns0:r>
-      <ns0:r ns0:rsidRPr="00B14FA3">
-        <ns0:rPr>
-          <ns0:rFonts ns0:eastAsia="宋体"/>
-          <ns0:color ns0:val="000000"/>
-          <ns0:sz ns0:val="21"/>
-          <ns0:szCs ns0:val="21"/>
-        </ns0:rPr>
-        <ns0:t>[8]</ns0:t>
-      </ns0:r>
-      <ns0:r ns0:rsidRPr="00B14FA3">
-        <ns0:rPr>
-          <ns0:rFonts ns0:eastAsia="宋体"/>
-          <ns0:color ns0:val="000000"/>
-          <ns0:sz ns0:val="21"/>
-          <ns0:szCs ns0:val="21"/>
-        </ns0:rPr>
-        <ns0:t>进一步将频域多层感知机与多尺度注意力结合，用于蜂窝网络流量预测。另一方面，</ns0:t>
-      </ns0:r>
-      <ns0:r ns0:rsidRPr="00B14FA3">
-        <ns0:rPr>
-          <ns0:rFonts ns0:eastAsia="宋体"/>
-          <ns0:color ns0:val="000000"/>
-          <ns0:sz ns0:val="21"/>
-          <ns0:szCs ns0:val="21"/>
-        </ns0:rPr>
-        <ns0:t>分解线性（Decomposition Linear，DLinear）模型</ns0:t>
-      </ns0:r>
-      <ns0:r ns0:rsidRPr="00B14FA3">
-        <ns0:rPr>
-          <ns0:rFonts ns0:eastAsia="宋体"/>
-          <ns0:color ns0:val="000000"/>
-          <ns0:sz ns0:val="21"/>
-          <ns0:szCs ns0:val="21"/>
-        </ns0:rPr>
-        <ns0:t>通过趋势项与余项分解配合线性映射实现多步预测，结构简单且参数量较少</ns0:t>
-      </ns0:r>
-      <ns0:r ns0:rsidRPr="00B14FA3">
-        <ns0:rPr>
-          <ns0:rFonts ns0:eastAsia="宋体"/>
-          <ns0:color ns0:val="000000"/>
-          <ns0:sz ns0:val="21"/>
-          <ns0:szCs ns0:val="21"/>
-        </ns0:rPr>
-        <ns0:t>[4]</ns0:t>
-      </ns0:r>
-      <ns0:r ns0:rsidRPr="00B14FA3">
-        <ns0:rPr>
-          <ns0:rFonts ns0:eastAsia="宋体"/>
-          <ns0:color ns0:val="000000"/>
-          <ns0:sz ns0:val="21"/>
-          <ns0:szCs ns0:val="21"/>
-        </ns0:rPr>
-        <ns0:t>，为构建轻量预测模型提供了基础。</ns0:t>
+        <ns0:t>网络流量在不同时间尺度上包含互补信息：细粒度序列保留局部变化，较粗粒度序列有助于突出相对平滑的趋势。Zhou等[3]利用多尺度回声状态网络提取不同时间尺度的流量特征；TimeMixer通过可分解多尺度混合实现不同分辨率信息交互[7]；CycleLLH从周期性整合角度改进网络流量预测[10]。在轻量时间序列预测方面，DLinear通过趋势项与余项分解配合线性映射实现多步预测[4]；LightTS采用连续采样和间隔采样配合多层感知机结构，以较低计算开销建模多变量时间序列[11]。这些研究说明，多尺度表征与简洁预测结构均具有应用潜力，也为在参数规模受控条件下进一步研究尺度融合提供了基础。</ns0:t>
       </ns0:r>
     </ns0:p>
     <ns0:p ns2:paraId="22D1E28C" ns2:textId="77777777" ns0:rsidR="00B14FA3" ns0:rsidRPr="00B14FA3" ns0:rsidRDefault="00B14FA3" ns0:rsidP="00B14FA3">
@@ -914,104 +472,14 @@
           <ns0:color ns0:val="000000"/>
         </ns0:rPr>
       </ns0:pPr>
-      <ns0:r ns0:rsidRPr="00B14FA3">
+      <ns0:r>
         <ns0:rPr>
           <ns0:rFonts ns0:eastAsia="宋体"/>
           <ns0:color ns0:val="000000"/>
           <ns0:sz ns0:val="21"/>
           <ns0:szCs ns0:val="21"/>
         </ns0:rPr>
-        <ns0:t>上述研究表明，多尺度信息和频率特征均有助于描述时间序列的复杂变化，但现有多尺度方法多采用固定尺度组合或较复杂的混合、注意力结构，对不同流量状态下尺度重要性的动态调节仍较有限；同时，过强的低频截断可能造成突发变化等有效信息损失。针对这些问题，本研究构建基于分解线性尺度专家的样本级自适应多尺度预测框架，以不同时间分辨率专家形成互补预测，并由轻量路由器依据输入窗口状态动态分配尺度权重；频域门控仅作为辅助模块，用于分析频率保留边界。该框架不依赖显式网络拓扑和复杂注意力结构，重点验证动态尺度融合对骨干网络OD流量短期预测的作用。</ns0:t>
-      </ns0:r>
-      <ns0:r ns0:rsidRPr="00B14FA3">
-        <ns0:rPr>
-          <ns0:rFonts ns0:eastAsia="宋体"/>
-          <ns0:color ns0:val="000000"/>
-          <ns0:sz ns0:val="21"/>
-          <ns0:szCs ns0:val="21"/>
-        </ns0:rPr>
-        <ns0:t/>
-      </ns0:r>
-      <ns0:r ns0:rsidRPr="00B14FA3">
-        <ns0:rPr>
-          <ns0:rFonts ns0:eastAsia="宋体"/>
-          <ns0:color ns0:val="000000"/>
-          <ns0:sz ns0:val="21"/>
-          <ns0:szCs ns0:val="21"/>
-        </ns0:rPr>
-        <ns0:t/>
-      </ns0:r>
-      <ns0:r ns0:rsidRPr="00B14FA3">
-        <ns0:rPr>
-          <ns0:rFonts ns0:eastAsia="宋体"/>
-          <ns0:color ns0:val="000000"/>
-          <ns0:sz ns0:val="21"/>
-          <ns0:szCs ns0:val="21"/>
-        </ns0:rPr>
-        <ns0:t/>
-      </ns0:r>
-      <ns0:r ns0:rsidRPr="00B14FA3">
-        <ns0:rPr>
-          <ns0:rFonts ns0:eastAsia="宋体"/>
-          <ns0:color ns0:val="000000"/>
-          <ns0:sz ns0:val="21"/>
-          <ns0:szCs ns0:val="21"/>
-        </ns0:rPr>
-        <ns0:t/>
-      </ns0:r>
-      <ns0:r ns0:rsidRPr="00B14FA3">
-        <ns0:rPr>
-          <ns0:rFonts ns0:eastAsia="宋体"/>
-          <ns0:color ns0:val="000000"/>
-          <ns0:sz ns0:val="21"/>
-          <ns0:szCs ns0:val="21"/>
-        </ns0:rPr>
-        <ns0:t/>
-      </ns0:r>
-      <ns0:r ns0:rsidRPr="00B14FA3">
-        <ns0:rPr>
-          <ns0:rFonts ns0:eastAsia="宋体"/>
-          <ns0:color ns0:val="000000"/>
-          <ns0:sz ns0:val="21"/>
-          <ns0:szCs ns0:val="21"/>
-        </ns0:rPr>
-        <ns0:t/>
-      </ns0:r>
-      <ns0:r ns0:rsidRPr="00B14FA3">
-        <ns0:rPr>
-          <ns0:rFonts ns0:eastAsia="宋体"/>
-          <ns0:color ns0:val="000000"/>
-          <ns0:sz ns0:val="21"/>
-          <ns0:szCs ns0:val="21"/>
-        </ns0:rPr>
-        <ns0:t/>
-      </ns0:r>
-      <ns0:r ns0:rsidRPr="00B14FA3">
-        <ns0:rPr>
-          <ns0:rFonts ns0:eastAsia="宋体"/>
-          <ns0:color ns0:val="000000"/>
-          <ns0:sz ns0:val="21"/>
-          <ns0:szCs ns0:val="21"/>
-        </ns0:rPr>
-        <ns0:t/>
-      </ns0:r>
-      <ns0:r ns0:rsidRPr="00B14FA3">
-        <ns0:rPr>
-          <ns0:rFonts ns0:eastAsia="宋体"/>
-          <ns0:color ns0:val="000000"/>
-          <ns0:sz ns0:val="21"/>
-          <ns0:szCs ns0:val="21"/>
-        </ns0:rPr>
-        <ns0:t/>
-      </ns0:r>
-      <ns0:r ns0:rsidRPr="00B14FA3">
-        <ns0:rPr>
-          <ns0:rFonts ns0:eastAsia="宋体"/>
-          <ns0:color ns0:val="000000"/>
-          <ns0:sz ns0:val="21"/>
-          <ns0:szCs ns0:val="21"/>
-        </ns0:rPr>
-        <ns0:t/>
+        <ns0:t>现有研究分别从拓扑关联、多尺度表征和轻量序列建模等角度提升预测能力，但在不显式依赖网络拓扑的历史OD序列预测场景中，如何根据当前输入窗口的状态动态确定不同时间尺度的重要性，仍值得进一步研究。为此，本文构建基于DLinear尺度专家的样本级自适应多尺度预测方法：采用尺度1、2和4构造多分辨率序列，由独立尺度专家生成候选预测，再从输入窗口提取均值、标准差、末时刻均值和平均绝对一阶差分，通过轻量路由网络生成Softmax权重，实现样本级动态融合。实验在Abilene和GÉANT两个骨干网数据集上开展，并引入DLinear、LightTS和固定等权多尺度模型进行比较；同时使用8个随机种子分析核心机制的稳定性，以检验性能改善是否来自样本级自适应尺度加权。</ns0:t>
       </ns0:r>
     </ns0:p>
     <ns0:p ns2:paraId="68ECE614" ns2:textId="77777777" ns0:rsidR="00B14FA3" ns0:rsidRPr="00B14FA3" ns0:rsidRDefault="00B14FA3" ns0:rsidP="00B14FA3"/>
@@ -12345,6 +11813,17 @@
           <ns0:sz ns0:val="18"/>
         </ns0:rPr>
         <ns0:t>, 2024, 47(12): 2867-2888. DOI: 10.11897/SP.J.1016.2024.02867.</ns0:t>
+      </ns0:r>
+    </ns0:p>
+    <ns0:p ns2:paraId="5133831D" ns2:textId="77777777" ns0:rsidR="00B14FA3" ns0:rsidRPr="00B14FA3" ns0:rsidRDefault="00B14FA3" ns0:rsidP="00B14FA3">
+      <ns0:pPr>
+        <ns0:ind ns0:left="420" ns0:hanging="420"/>
+      </ns0:pPr>
+      <ns0:r>
+        <ns0:rPr>
+          <ns0:sz ns0:val="18"/>
+        </ns0:rPr>
+        <ns0:t>[11] ZHANG T, ZHANG Y, CAO W, et al. Less is more: fast multivariate time series forecasting with light sampling-oriented MLP structures[EB/OL]. (2022-07-04)[2026-09-20]. https://arxiv.org/abs/2207.01186. DOI: 10.48550/arXiv.2207.01186.</ns0:t>
       </ns0:r>
     </ns0:p>
     <ns0:bookmarkEnd ns0:id="1"/>

</xml_diff>

<commit_message>
Rewrite abstracts keywords and conclusion for final evidence
</commit_message>
<xml_diff>
--- a/word_output/2026.09.19v2.docx
+++ b/word_output/2026.09.19v2.docx
@@ -178,7 +178,7 @@
       </ns0:r>
     </ns0:p>
     <ns0:p ns2:paraId="029BEDBD" ns2:textId="77777777" ns0:rsidR="00B14FA3" ns0:rsidRPr="00B14FA3" ns0:rsidRDefault="00B14FA3" ns0:rsidP="00B14FA3">
-      <ns0:r ns0:rsidRPr="00B14FA3">
+      <ns0:r>
         <ns0:rPr>
           <ns0:b/>
           <ns0:bCs/>
@@ -186,146 +186,26 @@
         </ns0:rPr>
         <ns0:t>摘要：</ns0:t>
       </ns0:r>
-      <ns0:r ns0:rsidRPr="00B14FA3">
+      <ns0:r>
         <ns0:rPr>
           <ns0:color ns0:val="000000"/>
         </ns0:rPr>
-        <ns0:t>为提高骨干网络源—目的节点对流量短期预测对不同时间尺度变化的适应能力，构建一种基于样本级自适应多尺度加权的轻量预测方法。采用尺度1、2和4的非重叠平均池化生成多分辨率序列，并分别输入独立的分解线性模型进行预测；提取窗口均值、标准差、末时刻均值和平均绝对一阶差分，经路由网络生成Softmax权重，对不同尺度专家输出进行样本级自适应融合，并设置低频门控分析频率保留比例的影响。在Abilene数据集上的实验表明，无频域门控的自适应多尺度模型相较于单尺度分解线性模型，均方误差和平均绝对误差分别降低4.06%和10.52%；在尺度集合和专家结构相同条件下，均方误差较固定等权融合降低3.95%；随着频率保留比例增加，含门控模型误差逐步下降，但仍未优于无频域模型。实验结果说明，样本级尺度权重有助于提高骨干网络源—目的节点对短期流量预测精度，频域处理更适合作为频率特征分析的补充手段。</ns0:t>
-      </ns0:r>
-      <ns0:r ns0:rsidRPr="00B14FA3">
-        <ns0:rPr>
-          <ns0:color ns0:val="000000"/>
-        </ns0:rPr>
-        <ns0:t/>
-      </ns0:r>
-      <ns0:r ns0:rsidRPr="00B14FA3">
-        <ns0:rPr>
-          <ns0:color ns0:val="000000"/>
-        </ns0:rPr>
-        <ns0:t/>
-      </ns0:r>
-      <ns0:r ns0:rsidRPr="00B14FA3">
-        <ns0:rPr>
-          <ns0:color ns0:val="000000"/>
-        </ns0:rPr>
-        <ns0:t/>
-      </ns0:r>
-      <ns0:r ns0:rsidRPr="00B14FA3">
-        <ns0:rPr>
-          <ns0:color ns0:val="000000"/>
-        </ns0:rPr>
-        <ns0:t/>
-      </ns0:r>
-      <ns0:r ns0:rsidRPr="00B14FA3">
-        <ns0:rPr>
-          <ns0:color ns0:val="000000"/>
-        </ns0:rPr>
-        <ns0:t/>
-      </ns0:r>
-      <ns0:r ns0:rsidRPr="00B14FA3">
-        <ns0:rPr>
-          <ns0:color ns0:val="000000"/>
-        </ns0:rPr>
-        <ns0:t/>
-      </ns0:r>
-      <ns0:r ns0:rsidRPr="00B14FA3">
-        <ns0:rPr>
-          <ns0:color ns0:val="000000"/>
-        </ns0:rPr>
-        <ns0:t/>
-      </ns0:r>
-      <ns0:r ns0:rsidRPr="00B14FA3">
-        <ns0:rPr>
-          <ns0:color ns0:val="000000"/>
-        </ns0:rPr>
-        <ns0:t/>
-      </ns0:r>
-      <ns0:r ns0:rsidRPr="00B14FA3">
-        <ns0:rPr>
-          <ns0:color ns0:val="000000"/>
-        </ns0:rPr>
-        <ns0:t/>
-      </ns0:r>
-      <ns0:r ns0:rsidRPr="00B14FA3">
-        <ns0:rPr>
-          <ns0:color ns0:val="000000"/>
-        </ns0:rPr>
-        <ns0:t/>
-      </ns0:r>
-      <ns0:r ns0:rsidRPr="00B14FA3">
-        <ns0:rPr>
-          <ns0:color ns0:val="000000"/>
-        </ns0:rPr>
-        <ns0:t/>
-      </ns0:r>
-      <ns0:r ns0:rsidRPr="00B14FA3">
-        <ns0:rPr>
-          <ns0:color ns0:val="000000"/>
-        </ns0:rPr>
-        <ns0:t/>
-      </ns0:r>
-      <ns0:r ns0:rsidRPr="00B14FA3">
-        <ns0:rPr>
-          <ns0:color ns0:val="000000"/>
-        </ns0:rPr>
-        <ns0:t/>
-      </ns0:r>
-      <ns0:r ns0:rsidRPr="00B14FA3">
-        <ns0:rPr>
-          <ns0:color ns0:val="000000"/>
-        </ns0:rPr>
-        <ns0:t/>
-      </ns0:r>
-      <ns0:r ns0:rsidRPr="00B14FA3">
-        <ns0:rPr>
-          <ns0:color ns0:val="000000"/>
-        </ns0:rPr>
-        <ns0:t/>
-      </ns0:r>
-      <ns0:r ns0:rsidRPr="00B14FA3">
-        <ns0:rPr>
-          <ns0:color ns0:val="000000"/>
-        </ns0:rPr>
-        <ns0:t/>
-      </ns0:r>
-      <ns0:r ns0:rsidRPr="00B14FA3">
-        <ns0:rPr>
-          <ns0:color ns0:val="000000"/>
-        </ns0:rPr>
-        <ns0:t/>
-      </ns0:r>
-      <ns0:r ns0:rsidRPr="00B14FA3">
-        <ns0:rPr>
-          <ns0:color ns0:val="000000"/>
-        </ns0:rPr>
-        <ns0:t/>
-      </ns0:r>
-      <ns0:r ns0:rsidRPr="00B14FA3">
-        <ns0:rPr>
-          <ns0:color ns0:val="000000"/>
-        </ns0:rPr>
-        <ns0:t/>
-      </ns0:r>
-      <ns0:r ns0:rsidRPr="00B14FA3">
-        <ns0:rPr>
-          <ns0:color ns0:val="000000"/>
-        </ns0:rPr>
-        <ns0:t/>
+        <ns0:t>为提高骨干网络源—目的节点对短期流量预测对不同时间尺度变化的适应能力，构建一种样本级自适应多尺度轻量预测方法。采用尺度1、2和4的非重叠平均池化生成多分辨率序列，由独立DLinear专家预测；提取窗口均值、标准差、末时刻均值和平均绝对一阶差分，经轻量路由网络生成Softmax权重，对各尺度结果动态融合。在Abilene和GÉANT数据集上，以DLinear、LightTS及固定等权多尺度模型为对比。共同3个随机种子下，所建方法的MSE较DLinear分别降低4.06%和4.43%，较LightTS分别降低29.89%和46.83%；8个随机种子的核心消融结果显示，相较固定等权融合，两数据集MSE分别降低1.67%和4.68%，其中GÉANT跨种子波动更大。结果表明，样本级动态尺度加权能够以较小参数增量利用不同时间分辨率的互补信息，但跨数据集稳定性仍需提升。</ns0:t>
       </ns0:r>
     </ns0:p>
     <ns0:p ns2:paraId="32FC1E8A" ns2:textId="77777777" ns0:rsidR="00B14FA3" ns0:rsidRPr="00B14FA3" ns0:rsidRDefault="00B14FA3" ns0:rsidP="00B14FA3">
       <ns0:pPr>
         <ns0:ind ns0:firstLine="0"/>
       </ns0:pPr>
-      <ns0:r ns0:rsidRPr="00B14FA3">
+      <ns0:r>
         <ns0:rPr>
           <ns0:rFonts ns0:eastAsia="黑体"/>
           <ns0:b/>
         </ns0:rPr>
         <ns0:t>关键词：</ns0:t>
       </ns0:r>
-      <ns0:r ns0:rsidRPr="00B14FA3">
-        <ns0:t>网络流量预测；多变量时间序列；多尺度学习；自适应加权；线性分解预测；频域分析</ns0:t>
+      <ns0:r>
+        <ns0:t>网络流量预测；多变量时间序列；多尺度学习；自适应加权；DLinear</ns0:t>
       </ns0:r>
     </ns0:p>
     <ns0:p ns2:paraId="0D2C546D" ns2:textId="77777777" ns0:rsidR="00B14FA3" ns0:rsidRPr="00B14FA3" ns0:rsidRDefault="00B14FA3" ns0:rsidP="00B14FA3">
@@ -389,42 +269,42 @@
       </ns0:r>
     </ns0:p>
     <ns0:p ns2:paraId="75C17346" ns2:textId="77777777" ns0:rsidR="00B14FA3" ns0:rsidRPr="00B14FA3" ns0:rsidRDefault="00B14FA3" ns0:rsidP="00B14FA3">
-      <ns0:r ns0:rsidRPr="00B14FA3">
+      <ns0:r>
         <ns0:rPr>
           <ns0:rFonts ns0:eastAsia="Times New Roman"/>
           <ns0:b/>
           <ns0:bCs/>
           <ns0:color ns0:val="000000"/>
         </ns0:rPr>
-        <ns0:t xml:space="preserve">Abstract: </ns0:t>
-      </ns0:r>
-      <ns0:r ns0:rsidRPr="00B14FA3">
+        <ns0:t>Abstract: </ns0:t>
+      </ns0:r>
+      <ns0:r>
         <ns0:rPr>
           <ns0:rFonts ns0:eastAsia="Times New Roman"/>
           <ns0:color ns0:val="000000"/>
         </ns0:rPr>
-        <ns0:t>A lightweight forecasting method based on sample-wise adaptive multiscale weighting was developed to improve the adaptability of short-term backbone origin-destination (OD) traffic forecasting to variations at different temporal scales. Non-overlapping average pooling with scales of 1, 2, and 4 was used to generate multiresolution sequences, which were separately processed by independent Decomposition-Linear (DLinear) models. The window mean, standard deviation, mean at the latest time step, and mean absolute first difference were extracted and fed into a routing network to generate Softmax weights for sample-wise adaptive fusion of the outputs from different scale experts. Low-frequency gating was also introduced to analyze the effect of the frequency-retention ratio. Experiments on the Abilene dataset showed that the ungated adaptive multiscale model reduced mean squared error and mean absolute error by 4.06% and 10.52%, respectively, compared with single-scale DLinear. With the same scale set and expert structures, the mean squared error was reduced by 3.95% compared with fixed equal weighting. As the frequency-retention ratio increased, the errors of the gated models gradually decreased, but remained higher than those of the ungated model. The results show that adaptive scale fusion effectively exploits complementary information across different temporal resolutions, while low-frequency gating can serve as an auxiliary module for frequency-characteristic analysis.</ns0:t>
+        <ns0:t>A lightweight forecasting method based on sample-wise adaptive multiscale weighting was developed to improve the adaptability of short-term backbone origin-destination (OD) traffic forecasting to variations at different temporal scales. Non-overlapping average pooling at scales 1, 2, and 4 was used to construct multiresolution sequences, which were processed by independent DLinear experts. The window mean, standard deviation, mean at the latest time step, and mean absolute first difference were extracted and fed into a lightweight routing network to generate Softmax weights for dynamic fusion of the scale-wise forecasts. Experiments were conducted on the Abilene and GÉANT datasets, with DLinear, LightTS, and a fixed equal-weight multiscale model as baselines. Under three common random seeds, the proposed method reduced MSE by 4.06% and 4.43% relative to DLinear, and by 29.89% and 46.83% relative to LightTS on Abilene and GÉANT, respectively. In the eight-seed core ablation, MSE was reduced by 1.67% and 4.68% compared with fixed equal weighting, while GÉANT exhibited larger cross-seed variability. These results indicate that sample-wise adaptive scale weighting can exploit complementary temporal-resolution information with only a small parameter increase, although robustness across datasets remains to be improved.</ns0:t>
       </ns0:r>
     </ns0:p>
     <ns0:p ns2:paraId="197031C1" ns2:textId="77777777" ns0:rsidR="00B14FA3" ns0:rsidRPr="00B14FA3" ns0:rsidRDefault="00B14FA3" ns0:rsidP="00B14FA3">
       <ns0:pPr>
         <ns0:ind ns0:firstLine="0"/>
       </ns0:pPr>
-      <ns0:r ns0:rsidRPr="00B14FA3">
+      <ns0:r>
         <ns0:rPr>
           <ns0:rFonts ns0:eastAsia="Times New Roman"/>
           <ns0:b/>
           <ns0:bCs/>
           <ns0:color ns0:val="000000"/>
         </ns0:rPr>
-        <ns0:t xml:space="preserve">Key words: </ns0:t>
-      </ns0:r>
-      <ns0:r ns0:rsidRPr="00B14FA3">
+        <ns0:t>Key words: </ns0:t>
+      </ns0:r>
+      <ns0:r>
         <ns0:rPr>
           <ns0:rFonts ns0:eastAsia="Times New Roman"/>
           <ns0:color ns0:val="000000"/>
         </ns0:rPr>
-        <ns0:t>network traffic forecasting; multivariate time series; multiscale learning; adaptive weighting; linear decomposition forecasting; frequency-domain analysis</ns0:t>
+        <ns0:t>network traffic forecasting; multivariate time series; multiscale learning; adaptive weighting; DLinear</ns0:t>
       </ns0:r>
     </ns0:p>
     <ns0:p ns2:paraId="00316D31" ns2:textId="77777777" ns0:rsidR="00B14FA3" ns0:rsidRPr="00B14FA3" ns0:rsidRDefault="00B14FA3" ns0:rsidP="00B14FA3">
@@ -11454,71 +11334,14 @@
       </ns0:r>
     </ns0:p>
     <ns0:p ns2:paraId="30963988" ns2:textId="77777777" ns0:rsidR="00B14FA3" ns0:rsidRPr="00B14FA3" ns0:rsidRDefault="00B14FA3" ns0:rsidP="00B14FA3">
-      <ns0:r ns0:rsidRPr="00B14FA3">
+      <ns0:r>
         <ns0:rPr>
           <ns0:rFonts ns0:eastAsia="宋体"/>
           <ns0:color ns0:val="000000"/>
           <ns0:sz ns0:val="21"/>
           <ns0:szCs ns0:val="21"/>
         </ns0:rPr>
-        <ns0:t>实验验证了样本级尺度路由对OD流量预测的增益，核心价值在于以轻量动态权重替代固定尺度组合；频域门控未带来额外优势，表明性能提升主要来自尺度自适应。当前验证仅限Abilene、固定预测长度且未建模拓扑，后续将扩展多数据集、多预测尺度及拓扑约束。</ns0:t>
-      </ns0:r>
-      <ns0:r ns0:rsidRPr="00B14FA3">
-        <ns0:t/>
-      </ns0:r>
-      <ns0:r ns0:rsidRPr="00B14FA3">
-        <ns0:rPr>
-          <ns0:color ns0:val="000000"/>
-        </ns0:rPr>
-        <ns0:t/>
-      </ns0:r>
-      <ns0:r ns0:rsidRPr="00B14FA3">
-        <ns0:rPr>
-          <ns0:color ns0:val="000000"/>
-        </ns0:rPr>
-        <ns0:t/>
-      </ns0:r>
-      <ns0:r ns0:rsidRPr="00B14FA3">
-        <ns0:rPr>
-          <ns0:color ns0:val="000000"/>
-        </ns0:rPr>
-        <ns0:t/>
-      </ns0:r>
-      <ns0:r ns0:rsidRPr="00B14FA3">
-        <ns0:rPr>
-          <ns0:color ns0:val="000000"/>
-        </ns0:rPr>
-        <ns0:t/>
-      </ns0:r>
-      <ns0:r ns0:rsidRPr="00B14FA3">
-        <ns0:rPr>
-          <ns0:color ns0:val="000000"/>
-        </ns0:rPr>
-        <ns0:t/>
-      </ns0:r>
-      <ns0:r ns0:rsidRPr="00B14FA3">
-        <ns0:rPr>
-          <ns0:color ns0:val="000000"/>
-        </ns0:rPr>
-        <ns0:t/>
-      </ns0:r>
-      <ns0:r ns0:rsidRPr="00B14FA3">
-        <ns0:rPr>
-          <ns0:color ns0:val="000000"/>
-        </ns0:rPr>
-        <ns0:t/>
-      </ns0:r>
-      <ns0:r ns0:rsidRPr="00B14FA3">
-        <ns0:rPr>
-          <ns0:color ns0:val="000000"/>
-        </ns0:rPr>
-        <ns0:t/>
-      </ns0:r>
-      <ns0:r ns0:rsidRPr="00B14FA3">
-        <ns0:rPr>
-          <ns0:color ns0:val="000000"/>
-        </ns0:rPr>
-        <ns0:t/>
+        <ns0:t>在Abilene和GÉANT上的实验表明，样本级自适应多尺度加权可在较小参数增量下改善固定等权融合，并降低相对DLinear和LightTS的平均预测误差；但GÉANT跨种子波动较大。后续将扩展更多网络、预测长度及拓扑约束，以进一步检验稳定性与泛化能力。</ns0:t>
       </ns0:r>
     </ns0:p>
     <ns0:p ns2:paraId="0E29F68B" ns2:textId="77777777" ns0:rsidR="00B14FA3" ns0:rsidRPr="00B14FA3" ns0:rsidRDefault="00B14FA3" ns0:rsidP="00B14FA3">

</xml_diff>